<commit_message>
gitignore updated and Project Write-up Completed
</commit_message>
<xml_diff>
--- a/AWS Console Details.docx
+++ b/AWS Console Details.docx
@@ -194,19 +194,33 @@
         <w:rPr>
           <w:rFonts w:ascii="Arial" w:hAnsi="Arial" w:cs="Arial"/>
         </w:rPr>
-        <w:t xml:space="preserve">Role Name </w:t>
-      </w:r>
-      <w:r>
-        <w:rPr>
-          <w:rFonts w:ascii="Arial" w:hAnsi="Arial" w:cs="Arial"/>
-        </w:rPr>
-        <w:t>–</w:t>
-      </w:r>
-      <w:r>
-        <w:rPr>
-          <w:rFonts w:ascii="Arial" w:hAnsi="Arial" w:cs="Arial"/>
-        </w:rPr>
-        <w:t xml:space="preserve"> CurrencyConverterLambdaExecutionRole</w:t>
+        <w:t xml:space="preserve">Role Name – </w:t>
+      </w:r>
+      <w:proofErr w:type="spellStart"/>
+      <w:r>
+        <w:rPr>
+          <w:rFonts w:ascii="Arial" w:hAnsi="Arial" w:cs="Arial"/>
+        </w:rPr>
+        <w:t>CurrencyConverterLambdaExecutionRole</w:t>
+      </w:r>
+      <w:proofErr w:type="spellEnd"/>
+    </w:p>
+    <w:p>
+      <w:pPr>
+        <w:tabs>
+          <w:tab w:val="left" w:pos="3402"/>
+        </w:tabs>
+        <w:ind w:left="3402" w:hanging="3402"/>
+        <w:rPr>
+          <w:rFonts w:ascii="Arial" w:hAnsi="Arial" w:cs="Arial"/>
+        </w:rPr>
+      </w:pPr>
+      <w:r>
+        <w:rPr>
+          <w:rFonts w:ascii="Arial" w:hAnsi="Arial" w:cs="Arial"/>
+        </w:rPr>
+        <w:tab/>
+        <w:t>Role Name – holiday-converter-backend-DeleteAccountFunctionRole-Z8UD4PUildZj</w:t>
       </w:r>
     </w:p>
     <w:p>
@@ -244,7 +258,32 @@
         <w:rPr>
           <w:rFonts w:ascii="Arial" w:hAnsi="Arial" w:cs="Arial"/>
         </w:rPr>
-        <w:t>Name – CurrencyConverterContactAlert</w:t>
+        <w:t xml:space="preserve">Name – </w:t>
+      </w:r>
+      <w:proofErr w:type="spellStart"/>
+      <w:r>
+        <w:rPr>
+          <w:rFonts w:ascii="Arial" w:hAnsi="Arial" w:cs="Arial"/>
+        </w:rPr>
+        <w:t>CurrencyConverterContactAlert</w:t>
+      </w:r>
+      <w:proofErr w:type="spellEnd"/>
+    </w:p>
+    <w:p>
+      <w:pPr>
+        <w:tabs>
+          <w:tab w:val="left" w:pos="3402"/>
+        </w:tabs>
+        <w:rPr>
+          <w:rFonts w:ascii="Arial" w:hAnsi="Arial" w:cs="Arial"/>
+        </w:rPr>
+      </w:pPr>
+      <w:r>
+        <w:rPr>
+          <w:rFonts w:ascii="Arial" w:hAnsi="Arial" w:cs="Arial"/>
+        </w:rPr>
+        <w:tab/>
+        <w:t>Name – Holiday-Converter-App-deletion-requests</w:t>
       </w:r>
     </w:p>
     <w:p>
@@ -284,12 +323,14 @@
         </w:rPr>
         <w:t xml:space="preserve">Name – </w:t>
       </w:r>
+      <w:proofErr w:type="spellStart"/>
       <w:r>
         <w:rPr>
           <w:rFonts w:ascii="Arial" w:hAnsi="Arial" w:cs="Arial"/>
         </w:rPr>
         <w:t>CurrencyConverterContactForm</w:t>
       </w:r>
+      <w:proofErr w:type="spellEnd"/>
     </w:p>
     <w:p>
       <w:pPr>
@@ -312,12 +353,31 @@
         </w:rPr>
         <w:t xml:space="preserve">Name – </w:t>
       </w:r>
+      <w:proofErr w:type="spellStart"/>
       <w:r>
         <w:rPr>
           <w:rFonts w:ascii="Arial" w:hAnsi="Arial" w:cs="Arial"/>
         </w:rPr>
         <w:t>recordCurrencyPurchase</w:t>
       </w:r>
+      <w:proofErr w:type="spellEnd"/>
+    </w:p>
+    <w:p>
+      <w:pPr>
+        <w:tabs>
+          <w:tab w:val="left" w:pos="3402"/>
+        </w:tabs>
+        <w:rPr>
+          <w:rFonts w:ascii="Arial" w:hAnsi="Arial" w:cs="Arial"/>
+        </w:rPr>
+      </w:pPr>
+      <w:r>
+        <w:rPr>
+          <w:rFonts w:ascii="Arial" w:hAnsi="Arial" w:cs="Arial"/>
+        </w:rPr>
+        <w:tab/>
+        <w:t>Name – holiday-converter-delete-account</w:t>
+      </w:r>
     </w:p>
     <w:p>
       <w:pPr>
@@ -357,12 +417,14 @@
         </w:rPr>
         <w:t xml:space="preserve">Name – </w:t>
       </w:r>
+      <w:proofErr w:type="spellStart"/>
       <w:r>
         <w:rPr>
           <w:rFonts w:ascii="Arial" w:hAnsi="Arial" w:cs="Arial"/>
         </w:rPr>
         <w:t>CurrencyConverterPurchaseDetails</w:t>
       </w:r>
+      <w:proofErr w:type="spellEnd"/>
     </w:p>
     <w:p>
       <w:pPr>
@@ -379,8 +441,16 @@
           <w:rFonts w:ascii="Arial" w:hAnsi="Arial" w:cs="Arial"/>
         </w:rPr>
         <w:tab/>
-        <w:t>Partition Key – userId</w:t>
-      </w:r>
+        <w:t xml:space="preserve">Partition Key – </w:t>
+      </w:r>
+      <w:proofErr w:type="spellStart"/>
+      <w:r>
+        <w:rPr>
+          <w:rFonts w:ascii="Arial" w:hAnsi="Arial" w:cs="Arial"/>
+        </w:rPr>
+        <w:t>userId</w:t>
+      </w:r>
+      <w:proofErr w:type="spellEnd"/>
     </w:p>
     <w:p>
       <w:pPr>
@@ -397,8 +467,16 @@
           <w:rFonts w:ascii="Arial" w:hAnsi="Arial" w:cs="Arial"/>
         </w:rPr>
         <w:tab/>
-        <w:t>Sort Key – purchaseDate</w:t>
-      </w:r>
+        <w:t xml:space="preserve">Sort Key – </w:t>
+      </w:r>
+      <w:proofErr w:type="spellStart"/>
+      <w:r>
+        <w:rPr>
+          <w:rFonts w:ascii="Arial" w:hAnsi="Arial" w:cs="Arial"/>
+        </w:rPr>
+        <w:t>purchaseDate</w:t>
+      </w:r>
+      <w:proofErr w:type="spellEnd"/>
     </w:p>
     <w:p>
       <w:pPr>
@@ -435,14 +513,41 @@
         <w:rPr>
           <w:rFonts w:ascii="Arial" w:hAnsi="Arial" w:cs="Arial"/>
         </w:rPr>
-        <w:t>Name –</w:t>
-      </w:r>
-      <w:r>
-        <w:rPr>
-          <w:rFonts w:ascii="Arial" w:hAnsi="Arial" w:cs="Arial"/>
-        </w:rPr>
-        <w:t xml:space="preserve"> CurrencyConverterAPI</w:t>
-      </w:r>
+        <w:t xml:space="preserve">Name – </w:t>
+      </w:r>
+      <w:proofErr w:type="spellStart"/>
+      <w:r>
+        <w:rPr>
+          <w:rFonts w:ascii="Arial" w:hAnsi="Arial" w:cs="Arial"/>
+        </w:rPr>
+        <w:t>CurrencyConverterAPI</w:t>
+      </w:r>
+      <w:proofErr w:type="spellEnd"/>
+    </w:p>
+    <w:p>
+      <w:pPr>
+        <w:tabs>
+          <w:tab w:val="left" w:pos="3402"/>
+        </w:tabs>
+        <w:rPr>
+          <w:rFonts w:ascii="Arial" w:hAnsi="Arial" w:cs="Arial"/>
+        </w:rPr>
+      </w:pPr>
+      <w:r>
+        <w:rPr>
+          <w:rFonts w:ascii="Arial" w:hAnsi="Arial" w:cs="Arial"/>
+        </w:rPr>
+        <w:tab/>
+        <w:t>Name – holiday-converter-</w:t>
+      </w:r>
+      <w:proofErr w:type="spellStart"/>
+      <w:r>
+        <w:rPr>
+          <w:rFonts w:ascii="Arial" w:hAnsi="Arial" w:cs="Arial"/>
+        </w:rPr>
+        <w:t>api</w:t>
+      </w:r>
+      <w:proofErr w:type="spellEnd"/>
     </w:p>
     <w:p>
       <w:pPr>
@@ -476,6 +581,96 @@
         <w:tab/>
         <w:t>Project Name – Currency Converter</w:t>
       </w:r>
+    </w:p>
+    <w:p>
+      <w:pPr>
+        <w:tabs>
+          <w:tab w:val="left" w:pos="3402"/>
+        </w:tabs>
+        <w:rPr>
+          <w:rFonts w:ascii="Arial" w:hAnsi="Arial" w:cs="Arial"/>
+        </w:rPr>
+      </w:pPr>
+    </w:p>
+    <w:p>
+      <w:pPr>
+        <w:tabs>
+          <w:tab w:val="left" w:pos="3402"/>
+        </w:tabs>
+        <w:rPr>
+          <w:rFonts w:ascii="Arial" w:hAnsi="Arial" w:cs="Arial"/>
+        </w:rPr>
+      </w:pPr>
+      <w:r>
+        <w:rPr>
+          <w:rFonts w:ascii="Arial" w:hAnsi="Arial" w:cs="Arial"/>
+        </w:rPr>
+        <w:t>S3</w:t>
+      </w:r>
+      <w:r>
+        <w:rPr>
+          <w:rFonts w:ascii="Arial" w:hAnsi="Arial" w:cs="Arial"/>
+        </w:rPr>
+        <w:tab/>
+        <w:t>Name – currency-converter-</w:t>
+      </w:r>
+      <w:proofErr w:type="spellStart"/>
+      <w:r>
+        <w:rPr>
+          <w:rFonts w:ascii="Arial" w:hAnsi="Arial" w:cs="Arial"/>
+        </w:rPr>
+        <w:t>sam</w:t>
+      </w:r>
+      <w:proofErr w:type="spellEnd"/>
+      <w:r>
+        <w:rPr>
+          <w:rFonts w:ascii="Arial" w:hAnsi="Arial" w:cs="Arial"/>
+        </w:rPr>
+        <w:t>-artifacts</w:t>
+      </w:r>
+    </w:p>
+    <w:p>
+      <w:pPr>
+        <w:tabs>
+          <w:tab w:val="left" w:pos="3402"/>
+        </w:tabs>
+        <w:rPr>
+          <w:rFonts w:ascii="Arial" w:hAnsi="Arial" w:cs="Arial"/>
+        </w:rPr>
+      </w:pPr>
+    </w:p>
+    <w:p>
+      <w:pPr>
+        <w:tabs>
+          <w:tab w:val="left" w:pos="3402"/>
+        </w:tabs>
+        <w:rPr>
+          <w:rFonts w:ascii="Arial" w:hAnsi="Arial" w:cs="Arial"/>
+        </w:rPr>
+      </w:pPr>
+      <w:r>
+        <w:rPr>
+          <w:rFonts w:ascii="Arial" w:hAnsi="Arial" w:cs="Arial"/>
+        </w:rPr>
+        <w:t>CloudFormation</w:t>
+      </w:r>
+      <w:r>
+        <w:rPr>
+          <w:rFonts w:ascii="Arial" w:hAnsi="Arial" w:cs="Arial"/>
+        </w:rPr>
+        <w:tab/>
+        <w:t>Stack Name – holiday-converter-backend</w:t>
+      </w:r>
+    </w:p>
+    <w:p>
+      <w:pPr>
+        <w:tabs>
+          <w:tab w:val="left" w:pos="3402"/>
+        </w:tabs>
+        <w:rPr>
+          <w:rFonts w:ascii="Arial" w:hAnsi="Arial" w:cs="Arial"/>
+        </w:rPr>
+      </w:pPr>
     </w:p>
     <w:p>
       <w:pPr>
@@ -1100,6 +1295,7 @@
   <w:style w:type="character" w:default="1" w:styleId="DefaultParagraphFont">
     <w:name w:val="Default Paragraph Font"/>
     <w:uiPriority w:val="1"/>
+    <w:semiHidden/>
     <w:unhideWhenUsed/>
   </w:style>
   <w:style w:type="table" w:default="1" w:styleId="TableNormal">

</xml_diff>